<commit_message>
D: restore documentation from stash and clean IDE files
</commit_message>
<xml_diff>
--- a/docs/praca_inz.docx
+++ b/docs/praca_inz.docx
@@ -20,6 +20,14 @@
     </w:p>
     <w:p>
       <w:pPr>
+        <w:ind w:firstLine="432"/>
+      </w:pPr>
+      <w:r>
+        <w:t>Nazwa aplikacji Lyix jest neologizmem wywodzącym się od angielskiego słowa lie (kłamstwo/kłamać). Dodana na końcu litera „x” nadaje nazwie bardziej międzynarodowego charakteru oraz subtelnie nawiązuje do trendu obecnego wśród wielu polskich przedsiębiorstw, które często wykorzystują tę literę w swoich markach.</w:t>
+      </w:r>
+    </w:p>
+    <w:p>
+      <w:pPr>
         <w:pStyle w:val="Heading2"/>
       </w:pPr>
       <w:r>
@@ -62,11 +70,25 @@
       </w:r>
     </w:p>
     <w:p>
-      <w:pPr>
-        <w:pStyle w:val="Heading2"/>
-      </w:pPr>
-      <w:r>
+      <w:r>
+        <w:t>W ramach niniejszego rozdziału omówiono rozwiązanie do wdrożenia Systemu do weryfikowania słów i działań osób publicznych. Przedstawio</w:t>
+      </w:r>
+      <w:r>
+        <w:t xml:space="preserve">ne zostały wymagania funkcjonalne, niefunkcjonalne oraz scenariusze przypadków użycia use case w podrozdziale na poszczególne komponenty systemu. </w:t>
+      </w:r>
+    </w:p>
+    <w:p>
+      <w:pPr>
+        <w:pStyle w:val="Heading2"/>
+      </w:pPr>
+      <w:r>
+        <w:lastRenderedPageBreak/>
         <w:t>Opis systemu</w:t>
+      </w:r>
+    </w:p>
+    <w:p>
+      <w:r>
+        <w:t xml:space="preserve">System zapewnia </w:t>
       </w:r>
     </w:p>
     <w:p>
@@ -186,72 +208,81 @@
         <w:pStyle w:val="Heading2"/>
       </w:pPr>
       <w:r>
+        <w:t>Procesy biznesowe</w:t>
+      </w:r>
+    </w:p>
+    <w:p>
+      <w:r>
+        <w:t>Może bedzie BPMN</w:t>
+      </w:r>
+    </w:p>
+    <w:p>
+      <w:r>
+        <w:t xml:space="preserve">Na początku analizy istotnym jest wskazanie odpowiednich zalezności i przepływów w procesach biznesowych. Początkowa faza zbierania wymagań polega na przeprowadzeniu rozmów z klientem, podczas których oddelegowane osoby </w:t>
+      </w:r>
+      <w:r>
+        <w:t>przekażą product owner’owi jakich funkcjonalności oczekują. Jest to bardzo ważny w procesie tworzenia systemu etap, gdyż od precyzyjnego określenia wymagań zależy końcowe zadowolenie kontrahenta. W celu ułatwienia komunikacji z interesariuszami przygotowane przez architekta rozwiązania zobrazowane zostały w postaci diagramów aktywności i stanów.</w:t>
+      </w:r>
+    </w:p>
+    <w:p>
+      <w:pPr>
+        <w:pStyle w:val="Heading3"/>
+      </w:pPr>
+      <w:r>
+        <w:t>Proces zakładania konta dla zwykłego użytkownika</w:t>
+      </w:r>
+    </w:p>
+    <w:p>
+      <w:r>
+        <w:t xml:space="preserve">Użytkownik podaje </w:t>
+      </w:r>
+    </w:p>
+    <w:p>
+      <w:pPr>
+        <w:pStyle w:val="Heading3"/>
+      </w:pPr>
+      <w:r>
+        <w:t>Proces zakładania konta dla osoby publicznej</w:t>
+      </w:r>
+    </w:p>
+    <w:p>
+      <w:pPr>
+        <w:pStyle w:val="Heading2"/>
+      </w:pPr>
+      <w:r>
+        <w:t>Logiczny model danych</w:t>
+      </w:r>
+    </w:p>
+    <w:p>
+      <w:pPr>
+        <w:pStyle w:val="Heading2"/>
+      </w:pPr>
+      <w:r>
+        <w:t>Diagram kontekstowy</w:t>
+      </w:r>
+    </w:p>
+    <w:p>
+      <w:pPr>
+        <w:pStyle w:val="Heading2"/>
+      </w:pPr>
+      <w:r>
+        <w:t>Komponenty</w:t>
+      </w:r>
+    </w:p>
+    <w:p>
+      <w:pPr>
+        <w:ind w:firstLine="576"/>
+      </w:pPr>
+      <w:r>
+        <w:t>W ramach podrozdziału opisałam poszczególne komponenty składajjące się na system Lyix</w:t>
+      </w:r>
+    </w:p>
+    <w:p>
+      <w:pPr>
+        <w:pStyle w:val="Heading3"/>
+      </w:pPr>
+      <w:r>
         <w:lastRenderedPageBreak/>
-        <w:t>Procesy biznesowe</w:t>
-      </w:r>
-    </w:p>
-    <w:p>
-      <w:pPr>
-        <w:pStyle w:val="Heading3"/>
-      </w:pPr>
-      <w:r>
-        <w:t>Proces zakładania konta dla zwykłego użytkownika</w:t>
-      </w:r>
-    </w:p>
-    <w:p>
-      <w:pPr>
-        <w:pStyle w:val="Heading3"/>
-      </w:pPr>
-      <w:r>
-        <w:t>Proces zakł</w:t>
-      </w:r>
-      <w:r>
-        <w:t>a</w:t>
-      </w:r>
-      <w:r>
-        <w:t xml:space="preserve">dania konta dla </w:t>
-      </w:r>
-      <w:r>
-        <w:t>osoby publicznej</w:t>
-      </w:r>
-    </w:p>
-    <w:p>
-      <w:pPr>
-        <w:pStyle w:val="Heading2"/>
-      </w:pPr>
-      <w:r>
-        <w:t>Logiczny model danych</w:t>
-      </w:r>
-    </w:p>
-    <w:p>
-      <w:pPr>
-        <w:pStyle w:val="Heading2"/>
-      </w:pPr>
-      <w:r>
-        <w:t>Diagram kontekstowy</w:t>
-      </w:r>
-    </w:p>
-    <w:p>
-      <w:pPr>
-        <w:pStyle w:val="Heading2"/>
-      </w:pPr>
-      <w:r>
-        <w:t>Komponenty</w:t>
-      </w:r>
-    </w:p>
-    <w:p>
-      <w:pPr>
-        <w:ind w:firstLine="576"/>
-      </w:pPr>
-      <w:r>
-        <w:t>W ramach podrozdziału opisałam poszczególne komponenty składajjące się na system Lyix</w:t>
-      </w:r>
-    </w:p>
-    <w:p>
-      <w:pPr>
-        <w:pStyle w:val="Heading3"/>
-      </w:pPr>
-      <w:r>
         <w:t>Nazwa komponentu &lt;sklep online&gt;</w:t>
       </w:r>
     </w:p>
@@ -328,6 +359,299 @@
         <w:t>Architektura systemu</w:t>
       </w:r>
     </w:p>
+    <w:p>
+      <w:r>
+        <w:t xml:space="preserve">Aplikację zdecydowałam się podzielić na moduły ze względu na </w:t>
+      </w:r>
+      <w:r>
+        <w:t xml:space="preserve">rozdzielenie </w:t>
+      </w:r>
+      <w:r>
+        <w:t>odpowiedzialnoś</w:t>
+      </w:r>
+      <w:r>
+        <w:t>ci. Inspiracją do zaprojektowania architektury backendu są rozwiązania stosowane w komercyjnych systemach opartych o architekturę Clean Architecture, jednak na potrzeby pracy inżynierskiej zastosowałam uproszczoną wersję tego podejścia.</w:t>
+      </w:r>
+    </w:p>
+    <w:p>
+      <w:r>
+        <w:t>Moduły w aplikacji:</w:t>
+      </w:r>
+    </w:p>
+    <w:p>
+      <w:pPr>
+        <w:pStyle w:val="ListParagraph"/>
+        <w:numPr>
+          <w:ilvl w:val="0"/>
+          <w:numId w:val="3"/>
+        </w:numPr>
+      </w:pPr>
+      <w:r>
+        <w:t xml:space="preserve">Domain - </w:t>
+      </w:r>
+    </w:p>
+    <w:p>
+      <w:pPr>
+        <w:pStyle w:val="ListParagraph"/>
+        <w:numPr>
+          <w:ilvl w:val="1"/>
+          <w:numId w:val="3"/>
+        </w:numPr>
+      </w:pPr>
+      <w:r>
+        <w:t>Encje domenowe</w:t>
+      </w:r>
+    </w:p>
+    <w:p>
+      <w:pPr>
+        <w:pStyle w:val="ListParagraph"/>
+        <w:numPr>
+          <w:ilvl w:val="1"/>
+          <w:numId w:val="3"/>
+        </w:numPr>
+      </w:pPr>
+      <w:r>
+        <w:t>Enumy</w:t>
+      </w:r>
+    </w:p>
+    <w:p>
+      <w:pPr>
+        <w:pStyle w:val="ListParagraph"/>
+        <w:numPr>
+          <w:ilvl w:val="1"/>
+          <w:numId w:val="3"/>
+        </w:numPr>
+      </w:pPr>
+      <w:r>
+        <w:t>Value objects</w:t>
+      </w:r>
+    </w:p>
+    <w:p>
+      <w:pPr>
+        <w:pStyle w:val="ListParagraph"/>
+        <w:numPr>
+          <w:ilvl w:val="1"/>
+          <w:numId w:val="3"/>
+        </w:numPr>
+      </w:pPr>
+      <w:r>
+        <w:t>Interface repozytoriów</w:t>
+      </w:r>
+    </w:p>
+    <w:p>
+      <w:pPr>
+        <w:pStyle w:val="ListParagraph"/>
+        <w:numPr>
+          <w:ilvl w:val="1"/>
+          <w:numId w:val="3"/>
+        </w:numPr>
+      </w:pPr>
+      <w:r>
+        <w:t>Wyjątki domenowe</w:t>
+      </w:r>
+    </w:p>
+    <w:p>
+      <w:pPr>
+        <w:pStyle w:val="ListParagraph"/>
+        <w:numPr>
+          <w:ilvl w:val="1"/>
+          <w:numId w:val="3"/>
+        </w:numPr>
+      </w:pPr>
+      <w:r>
+        <w:t>Logika biznesowa</w:t>
+      </w:r>
+    </w:p>
+    <w:p>
+      <w:pPr>
+        <w:pStyle w:val="ListParagraph"/>
+        <w:numPr>
+          <w:ilvl w:val="0"/>
+          <w:numId w:val="3"/>
+        </w:numPr>
+      </w:pPr>
+      <w:r>
+        <w:t>Application</w:t>
+      </w:r>
+    </w:p>
+    <w:p>
+      <w:pPr>
+        <w:pStyle w:val="ListParagraph"/>
+        <w:numPr>
+          <w:ilvl w:val="1"/>
+          <w:numId w:val="3"/>
+        </w:numPr>
+      </w:pPr>
+      <w:r>
+        <w:t>Przypadki użycia (use case)</w:t>
+      </w:r>
+    </w:p>
+    <w:p>
+      <w:pPr>
+        <w:pStyle w:val="ListParagraph"/>
+        <w:numPr>
+          <w:ilvl w:val="1"/>
+          <w:numId w:val="3"/>
+        </w:numPr>
+      </w:pPr>
+      <w:r>
+        <w:t>Transakcje (na poziomie usecase)</w:t>
+      </w:r>
+    </w:p>
+    <w:p>
+      <w:pPr>
+        <w:pStyle w:val="ListParagraph"/>
+        <w:numPr>
+          <w:ilvl w:val="1"/>
+          <w:numId w:val="3"/>
+        </w:numPr>
+      </w:pPr>
+      <w:r>
+        <w:t>Koordynacja domeny</w:t>
+      </w:r>
+    </w:p>
+    <w:p>
+      <w:pPr>
+        <w:pStyle w:val="ListParagraph"/>
+        <w:numPr>
+          <w:ilvl w:val="0"/>
+          <w:numId w:val="3"/>
+        </w:numPr>
+      </w:pPr>
+      <w:r>
+        <w:t>Persistence</w:t>
+      </w:r>
+    </w:p>
+    <w:p>
+      <w:pPr>
+        <w:pStyle w:val="ListParagraph"/>
+        <w:numPr>
+          <w:ilvl w:val="1"/>
+          <w:numId w:val="3"/>
+        </w:numPr>
+      </w:pPr>
+      <w:r>
+        <w:t>Encje JPA</w:t>
+      </w:r>
+    </w:p>
+    <w:p>
+      <w:pPr>
+        <w:pStyle w:val="ListParagraph"/>
+        <w:numPr>
+          <w:ilvl w:val="1"/>
+          <w:numId w:val="3"/>
+        </w:numPr>
+      </w:pPr>
+      <w:r>
+        <w:t>Spring Data repositories</w:t>
+      </w:r>
+    </w:p>
+    <w:p>
+      <w:pPr>
+        <w:pStyle w:val="ListParagraph"/>
+        <w:numPr>
+          <w:ilvl w:val="1"/>
+          <w:numId w:val="3"/>
+        </w:numPr>
+      </w:pPr>
+      <w:r>
+        <w:t>Mappery dsomain &lt;-&gt; entity</w:t>
+      </w:r>
+    </w:p>
+    <w:p>
+      <w:pPr>
+        <w:pStyle w:val="ListParagraph"/>
+        <w:numPr>
+          <w:ilvl w:val="1"/>
+          <w:numId w:val="3"/>
+        </w:numPr>
+      </w:pPr>
+      <w:r>
+        <w:t>Konfiguracja bazy danych</w:t>
+      </w:r>
+    </w:p>
+    <w:p>
+      <w:pPr>
+        <w:pStyle w:val="ListParagraph"/>
+        <w:numPr>
+          <w:ilvl w:val="0"/>
+          <w:numId w:val="3"/>
+        </w:numPr>
+      </w:pPr>
+      <w:r>
+        <w:t>Api</w:t>
+      </w:r>
+    </w:p>
+    <w:p>
+      <w:pPr>
+        <w:pStyle w:val="ListParagraph"/>
+        <w:numPr>
+          <w:ilvl w:val="1"/>
+          <w:numId w:val="3"/>
+        </w:numPr>
+      </w:pPr>
+      <w:r>
+        <w:t>@SpringBootApplication</w:t>
+      </w:r>
+    </w:p>
+    <w:p>
+      <w:pPr>
+        <w:pStyle w:val="ListParagraph"/>
+        <w:numPr>
+          <w:ilvl w:val="1"/>
+          <w:numId w:val="3"/>
+        </w:numPr>
+      </w:pPr>
+      <w:r>
+        <w:t>Kontrolery REST</w:t>
+      </w:r>
+    </w:p>
+    <w:p>
+      <w:pPr>
+        <w:pStyle w:val="ListParagraph"/>
+        <w:numPr>
+          <w:ilvl w:val="1"/>
+          <w:numId w:val="3"/>
+        </w:numPr>
+      </w:pPr>
+      <w:r>
+        <w:lastRenderedPageBreak/>
+        <w:t>DTO request/response</w:t>
+      </w:r>
+    </w:p>
+    <w:p>
+      <w:pPr>
+        <w:pStyle w:val="ListParagraph"/>
+        <w:numPr>
+          <w:ilvl w:val="1"/>
+          <w:numId w:val="3"/>
+        </w:numPr>
+      </w:pPr>
+      <w:r>
+        <w:t>Walidacja</w:t>
+      </w:r>
+    </w:p>
+    <w:p>
+      <w:pPr>
+        <w:pStyle w:val="ListParagraph"/>
+        <w:numPr>
+          <w:ilvl w:val="1"/>
+          <w:numId w:val="3"/>
+        </w:numPr>
+      </w:pPr>
+      <w:r>
+        <w:t>Obsługa wyjątków</w:t>
+      </w:r>
+    </w:p>
+    <w:p>
+      <w:r>
+        <w:br/>
+      </w:r>
+      <w:r>
+        <w:t xml:space="preserve">Baza danych zainstalowana będzie w kontenerze dockerowym. </w:t>
+      </w:r>
+    </w:p>
+    <w:p/>
     <w:p>
       <w:pPr>
         <w:pStyle w:val="Heading2"/>
@@ -508,11 +832,120 @@
         <w:t>Słownik pojęć</w:t>
       </w:r>
     </w:p>
-    <w:p>
-      <w:pPr>
-        <w:pStyle w:val="Heading2"/>
-      </w:pPr>
-      <w:r>
+    <w:tbl>
+      <w:tblPr>
+        <w:tblStyle w:val="TableGrid"/>
+        <w:tblW w:w="0" w:type="auto"/>
+        <w:tblLook w:val="04A0" w:firstRow="1" w:lastRow="0" w:firstColumn="1" w:lastColumn="0" w:noHBand="0" w:noVBand="1"/>
+      </w:tblPr>
+      <w:tblGrid>
+        <w:gridCol w:w="2122"/>
+        <w:gridCol w:w="6940"/>
+      </w:tblGrid>
+      <w:tr>
+        <w:tc>
+          <w:tcPr>
+            <w:tcW w:w="2122" w:type="dxa"/>
+          </w:tcPr>
+          <w:p>
+            <w:r>
+              <w:t>Słowo</w:t>
+            </w:r>
+          </w:p>
+        </w:tc>
+        <w:tc>
+          <w:tcPr>
+            <w:tcW w:w="6940" w:type="dxa"/>
+          </w:tcPr>
+          <w:p>
+            <w:r>
+              <w:t>Definicja</w:t>
+            </w:r>
+          </w:p>
+        </w:tc>
+      </w:tr>
+      <w:tr>
+        <w:tc>
+          <w:tcPr>
+            <w:tcW w:w="2122" w:type="dxa"/>
+          </w:tcPr>
+          <w:p>
+            <w:r>
+              <w:t>Docker</w:t>
+            </w:r>
+          </w:p>
+        </w:tc>
+        <w:tc>
+          <w:tcPr>
+            <w:tcW w:w="6940" w:type="dxa"/>
+          </w:tcPr>
+          <w:p/>
+        </w:tc>
+      </w:tr>
+      <w:tr>
+        <w:tc>
+          <w:tcPr>
+            <w:tcW w:w="2122" w:type="dxa"/>
+          </w:tcPr>
+          <w:p/>
+        </w:tc>
+        <w:tc>
+          <w:tcPr>
+            <w:tcW w:w="6940" w:type="dxa"/>
+          </w:tcPr>
+          <w:p/>
+        </w:tc>
+      </w:tr>
+      <w:tr>
+        <w:tc>
+          <w:tcPr>
+            <w:tcW w:w="2122" w:type="dxa"/>
+          </w:tcPr>
+          <w:p/>
+        </w:tc>
+        <w:tc>
+          <w:tcPr>
+            <w:tcW w:w="6940" w:type="dxa"/>
+          </w:tcPr>
+          <w:p/>
+        </w:tc>
+      </w:tr>
+      <w:tr>
+        <w:tc>
+          <w:tcPr>
+            <w:tcW w:w="2122" w:type="dxa"/>
+          </w:tcPr>
+          <w:p/>
+        </w:tc>
+        <w:tc>
+          <w:tcPr>
+            <w:tcW w:w="6940" w:type="dxa"/>
+          </w:tcPr>
+          <w:p/>
+        </w:tc>
+      </w:tr>
+      <w:tr>
+        <w:tc>
+          <w:tcPr>
+            <w:tcW w:w="2122" w:type="dxa"/>
+          </w:tcPr>
+          <w:p/>
+        </w:tc>
+        <w:tc>
+          <w:tcPr>
+            <w:tcW w:w="6940" w:type="dxa"/>
+          </w:tcPr>
+          <w:p/>
+        </w:tc>
+      </w:tr>
+    </w:tbl>
+    <w:p/>
+    <w:p>
+      <w:pPr>
+        <w:pStyle w:val="Heading2"/>
+      </w:pPr>
+      <w:r>
+        <w:lastRenderedPageBreak/>
         <w:t>Jaki program wybrałam do projektowania i dlaczego (pewnie figma)</w:t>
       </w:r>
     </w:p>
@@ -521,32 +954,184 @@
         <w:pStyle w:val="Heading2"/>
       </w:pPr>
       <w:r>
+        <w:t>Design system oraz bilbkioteka kompoentow</w:t>
+      </w:r>
+    </w:p>
+    <w:p>
+      <w:pPr>
+        <w:pStyle w:val="Heading2"/>
+      </w:pPr>
+      <w:r>
+        <w:t>Prototypowanie a faktyczny design</w:t>
+      </w:r>
+    </w:p>
+    <w:p>
+      <w:pPr>
+        <w:pStyle w:val="Heading2"/>
+      </w:pPr>
+      <w:r>
+        <w:t>Element systemu jak np. Strona internetowa</w:t>
+      </w:r>
+    </w:p>
+    <w:p>
+      <w:pPr>
+        <w:pStyle w:val="Heading3"/>
+      </w:pPr>
+      <w:r>
+        <w:t>Elementy UI</w:t>
+      </w:r>
+    </w:p>
+    <w:p>
+      <w:pPr>
+        <w:pStyle w:val="Heading1"/>
+      </w:pPr>
+      <w:r>
+        <w:t xml:space="preserve">Implementacja systemu </w:t>
+      </w:r>
+    </w:p>
+    <w:p>
+      <w:pPr>
+        <w:pStyle w:val="Heading2"/>
+      </w:pPr>
+      <w:r>
+        <w:t>DevOps</w:t>
+      </w:r>
+    </w:p>
+    <w:p>
+      <w:pPr>
+        <w:pStyle w:val="Heading2"/>
+      </w:pPr>
+      <w:r>
+        <w:t>Architektura warstrwowa i zasoby REST API</w:t>
+      </w:r>
+    </w:p>
+    <w:p>
+      <w:pPr>
+        <w:pStyle w:val="Heading3"/>
+      </w:pPr>
+      <w:r>
+        <w:t>Warstwa prezentacji</w:t>
+      </w:r>
+    </w:p>
+    <w:p>
+      <w:pPr>
+        <w:pStyle w:val="Heading3"/>
+      </w:pPr>
+      <w:r>
+        <w:t>Warstwa logiki biznesowej</w:t>
+      </w:r>
+    </w:p>
+    <w:p>
+      <w:pPr>
+        <w:pStyle w:val="Heading3"/>
+      </w:pPr>
+      <w:r>
+        <w:t>warstwa dostepu do danych</w:t>
+      </w:r>
+    </w:p>
+    <w:p>
+      <w:pPr>
+        <w:pStyle w:val="Heading3"/>
+      </w:pPr>
+      <w:r>
+        <w:t>encje</w:t>
+      </w:r>
+    </w:p>
+    <w:p>
+      <w:pPr>
+        <w:pStyle w:val="Heading3"/>
+      </w:pPr>
+      <w:r>
+        <w:t>DTO</w:t>
+      </w:r>
+    </w:p>
+    <w:p>
+      <w:pPr>
+        <w:pStyle w:val="Heading2"/>
+      </w:pPr>
+      <w:r>
+        <w:t>Odwrócenie sterowania i wstrzykiwanie zależnosci</w:t>
+      </w:r>
+    </w:p>
+    <w:p>
+      <w:pPr>
+        <w:pStyle w:val="Heading2"/>
+      </w:pPr>
+      <w:r>
+        <w:t>Dostęp do relacyjnej bazy danych z wykorzystaniem ORM</w:t>
+      </w:r>
+    </w:p>
+    <w:p>
+      <w:pPr>
+        <w:pStyle w:val="Heading2"/>
+      </w:pPr>
+      <w:r>
+        <w:t>Zabezpiecznie aplikacji Oauth2 i JWT</w:t>
+      </w:r>
+    </w:p>
+    <w:p>
+      <w:pPr>
+        <w:pStyle w:val="Heading2"/>
+      </w:pPr>
+      <w:r>
+        <w:t>OpenAPI???</w:t>
+      </w:r>
+    </w:p>
+    <w:p>
+      <w:pPr>
+        <w:pStyle w:val="Heading2"/>
+      </w:pPr>
+      <w:r>
+        <w:t>Pozostałe funkcjonalności</w:t>
+      </w:r>
+    </w:p>
+    <w:p>
+      <w:pPr>
+        <w:pStyle w:val="Heading2"/>
+      </w:pPr>
+      <w:r>
+        <w:t>Implementacja interfejsu użytkownika</w:t>
+      </w:r>
+    </w:p>
+    <w:p>
+      <w:pPr>
+        <w:pStyle w:val="Heading2"/>
+      </w:pPr>
+      <w:r>
+        <w:t>Aplikacja mobilna</w:t>
+      </w:r>
+    </w:p>
+    <w:p>
+      <w:pPr>
+        <w:pStyle w:val="Heading1"/>
+      </w:pPr>
+      <w:r>
+        <w:t>Testy systemu</w:t>
+      </w:r>
+    </w:p>
+    <w:p>
+      <w:pPr>
+        <w:pStyle w:val="Heading2"/>
+      </w:pPr>
+      <w:r>
+        <w:t>Jednostkowe i integfracyjne</w:t>
+      </w:r>
+    </w:p>
+    <w:p>
+      <w:pPr>
+        <w:pStyle w:val="Heading2"/>
+      </w:pPr>
+      <w:r>
         <w:lastRenderedPageBreak/>
-        <w:t>Design system oraz bilbkioteka kompoentow</w:t>
-      </w:r>
-    </w:p>
-    <w:p>
-      <w:pPr>
-        <w:pStyle w:val="Heading2"/>
-      </w:pPr>
-      <w:r>
-        <w:t>Prototypowanie a faktyczny design</w:t>
-      </w:r>
-    </w:p>
-    <w:p>
-      <w:pPr>
-        <w:pStyle w:val="Heading2"/>
-      </w:pPr>
-      <w:r>
-        <w:t>Element systemu jak np. Strona internetowa</w:t>
-      </w:r>
-    </w:p>
-    <w:p>
-      <w:pPr>
-        <w:pStyle w:val="Heading3"/>
-      </w:pPr>
-      <w:r>
-        <w:t>Elementy UI</w:t>
+        <w:t>Systemowe częsci webowej</w:t>
+      </w:r>
+    </w:p>
+    <w:p>
+      <w:pPr>
+        <w:pStyle w:val="Heading2"/>
+      </w:pPr>
+      <w:r>
+        <w:t>Aplikacji moilnej</w:t>
       </w:r>
     </w:p>
     <w:p>
@@ -554,119 +1139,39 @@
         <w:pStyle w:val="Heading1"/>
       </w:pPr>
       <w:r>
-        <w:t xml:space="preserve">Implementacja systemu </w:t>
-      </w:r>
-    </w:p>
-    <w:p>
-      <w:pPr>
-        <w:pStyle w:val="Heading2"/>
-      </w:pPr>
-      <w:r>
-        <w:t>DevOps</w:t>
-      </w:r>
-    </w:p>
-    <w:p>
-      <w:pPr>
-        <w:pStyle w:val="Heading2"/>
-      </w:pPr>
-      <w:r>
-        <w:t>Architektura warstrwowa i zasoby REST API</w:t>
-      </w:r>
-    </w:p>
-    <w:p>
-      <w:pPr>
-        <w:pStyle w:val="Heading3"/>
-      </w:pPr>
-      <w:r>
-        <w:t>Warstwa prezentacji</w:t>
-      </w:r>
-    </w:p>
-    <w:p>
-      <w:pPr>
-        <w:pStyle w:val="Heading3"/>
-      </w:pPr>
-      <w:r>
-        <w:t>Warstwa logiki biznesowej</w:t>
-      </w:r>
-    </w:p>
-    <w:p>
-      <w:pPr>
-        <w:pStyle w:val="Heading3"/>
-      </w:pPr>
-      <w:r>
-        <w:t>warstwa dostepu do danych</w:t>
-      </w:r>
-    </w:p>
-    <w:p>
-      <w:pPr>
-        <w:pStyle w:val="Heading3"/>
-      </w:pPr>
-      <w:r>
-        <w:t>encje</w:t>
-      </w:r>
-    </w:p>
-    <w:p>
-      <w:pPr>
-        <w:pStyle w:val="Heading3"/>
-      </w:pPr>
-      <w:r>
-        <w:t>DTO</w:t>
-      </w:r>
-    </w:p>
-    <w:p>
-      <w:pPr>
-        <w:pStyle w:val="Heading2"/>
-      </w:pPr>
-      <w:r>
-        <w:t>Odwrócenie sterowania i wstrzykiwanie zależnosci</w:t>
-      </w:r>
-    </w:p>
-    <w:p>
-      <w:pPr>
-        <w:pStyle w:val="Heading2"/>
-      </w:pPr>
-      <w:r>
-        <w:t>Dostęp do relacyjnej bazy danych z wykorzystaniem ORM</w:t>
-      </w:r>
-    </w:p>
-    <w:p>
-      <w:pPr>
-        <w:pStyle w:val="Heading2"/>
-      </w:pPr>
-      <w:r>
-        <w:t>Zabezpiecznie aplikacji Oauth2 i JWT</w:t>
-      </w:r>
-    </w:p>
-    <w:p>
-      <w:pPr>
-        <w:pStyle w:val="Heading2"/>
-      </w:pPr>
-      <w:r>
-        <w:t>OpenAPI???</w:t>
-      </w:r>
-    </w:p>
-    <w:p>
-      <w:pPr>
-        <w:pStyle w:val="Heading2"/>
-      </w:pPr>
-      <w:r>
-        <w:t>Pozostałe funkcjonalności</w:t>
-      </w:r>
-    </w:p>
-    <w:p>
-      <w:pPr>
-        <w:pStyle w:val="Heading2"/>
-      </w:pPr>
-      <w:r>
-        <w:t>Implementacja interfejsu użytkownika</w:t>
-      </w:r>
-    </w:p>
-    <w:p>
-      <w:pPr>
-        <w:pStyle w:val="Heading2"/>
-      </w:pPr>
-      <w:r>
-        <w:t>Aplikacja mobilna</w:t>
+        <w:t>Podsumowanie i perspektywa rozwoju</w:t>
+      </w:r>
+    </w:p>
+    <w:p>
+      <w:pPr>
+        <w:pStyle w:val="Heading2"/>
+      </w:pPr>
+      <w:r>
+        <w:t>Efekty końcowe</w:t>
+      </w:r>
+    </w:p>
+    <w:p>
+      <w:pPr>
+        <w:pStyle w:val="Heading2"/>
+      </w:pPr>
+      <w:r>
+        <w:t>Napotkane trudności</w:t>
+      </w:r>
+    </w:p>
+    <w:p>
+      <w:pPr>
+        <w:pStyle w:val="Heading2"/>
+      </w:pPr>
+      <w:r>
+        <w:t>Dalszy rozwój</w:t>
+      </w:r>
+    </w:p>
+    <w:p>
+      <w:pPr>
+        <w:pStyle w:val="Heading2"/>
+      </w:pPr>
+      <w:r>
+        <w:t>Wnioski końcowe</w:t>
       </w:r>
     </w:p>
     <w:p>
@@ -674,32 +1179,7 @@
         <w:pStyle w:val="Heading1"/>
       </w:pPr>
       <w:r>
-        <w:t>Testy systemu</w:t>
-      </w:r>
-    </w:p>
-    <w:p>
-      <w:pPr>
-        <w:pStyle w:val="Heading2"/>
-      </w:pPr>
-      <w:r>
-        <w:t>Jednostkowe i integfracyjne</w:t>
-      </w:r>
-    </w:p>
-    <w:p>
-      <w:pPr>
-        <w:pStyle w:val="Heading2"/>
-      </w:pPr>
-      <w:r>
-        <w:t>Systemowe częsci webowej</w:t>
-      </w:r>
-    </w:p>
-    <w:p>
-      <w:pPr>
-        <w:pStyle w:val="Heading2"/>
-      </w:pPr>
-      <w:r>
-        <w:lastRenderedPageBreak/>
-        <w:t>Aplikacji moilnej</w:t>
+        <w:t>Bibliografia</w:t>
       </w:r>
     </w:p>
     <w:p>
@@ -707,39 +1187,7 @@
         <w:pStyle w:val="Heading1"/>
       </w:pPr>
       <w:r>
-        <w:t>Podsumowanie i perspektywa rozwoju</w:t>
-      </w:r>
-    </w:p>
-    <w:p>
-      <w:pPr>
-        <w:pStyle w:val="Heading2"/>
-      </w:pPr>
-      <w:r>
-        <w:t>Efekty końcowe</w:t>
-      </w:r>
-    </w:p>
-    <w:p>
-      <w:pPr>
-        <w:pStyle w:val="Heading2"/>
-      </w:pPr>
-      <w:r>
-        <w:t>Napotkane trudności</w:t>
-      </w:r>
-    </w:p>
-    <w:p>
-      <w:pPr>
-        <w:pStyle w:val="Heading2"/>
-      </w:pPr>
-      <w:r>
-        <w:t>Dalszy rozwój</w:t>
-      </w:r>
-    </w:p>
-    <w:p>
-      <w:pPr>
-        <w:pStyle w:val="Heading2"/>
-      </w:pPr>
-      <w:r>
-        <w:t>Wnioski końcowe</w:t>
+        <w:t xml:space="preserve"> Spis rysunków</w:t>
       </w:r>
     </w:p>
     <w:p>
@@ -747,7 +1195,7 @@
         <w:pStyle w:val="Heading1"/>
       </w:pPr>
       <w:r>
-        <w:t>Bibliografia</w:t>
+        <w:t xml:space="preserve"> Spis tabel</w:t>
       </w:r>
     </w:p>
     <w:p>
@@ -755,26 +1203,9 @@
         <w:pStyle w:val="Heading1"/>
       </w:pPr>
       <w:r>
-        <w:t xml:space="preserve"> Spis rysunków</w:t>
-      </w:r>
-    </w:p>
-    <w:p>
-      <w:pPr>
-        <w:pStyle w:val="Heading1"/>
-      </w:pPr>
-      <w:r>
-        <w:t xml:space="preserve"> Spis tabel</w:t>
-      </w:r>
-    </w:p>
-    <w:p>
-      <w:pPr>
-        <w:pStyle w:val="Heading1"/>
-      </w:pPr>
-      <w:r>
         <w:t xml:space="preserve"> Spis listingów</w:t>
       </w:r>
     </w:p>
-    <w:p/>
     <w:p/>
     <w:p/>
     <w:sectPr>
@@ -970,11 +1401,127 @@
       </w:pPr>
     </w:lvl>
   </w:abstractNum>
+  <w:abstractNum w:abstractNumId="2" w15:restartNumberingAfterBreak="0">
+    <w:nsid w:val="7D6266F3"/>
+    <w:multiLevelType w:val="hybridMultilevel"/>
+    <w:tmpl w:val="99389A22"/>
+    <w:lvl w:ilvl="0" w:tplc="04150001">
+      <w:start w:val="1"/>
+      <w:numFmt w:val="bullet"/>
+      <w:lvlText w:val=""/>
+      <w:lvlJc w:val="left"/>
+      <w:pPr>
+        <w:ind w:left="720" w:hanging="360"/>
+      </w:pPr>
+      <w:rPr>
+        <w:rFonts w:ascii="Symbol" w:hAnsi="Symbol" w:hint="default"/>
+      </w:rPr>
+    </w:lvl>
+    <w:lvl w:ilvl="1" w:tplc="04150003">
+      <w:start w:val="1"/>
+      <w:numFmt w:val="bullet"/>
+      <w:lvlText w:val="o"/>
+      <w:lvlJc w:val="left"/>
+      <w:pPr>
+        <w:ind w:left="1440" w:hanging="360"/>
+      </w:pPr>
+      <w:rPr>
+        <w:rFonts w:ascii="Courier New" w:hAnsi="Courier New" w:cs="Courier New" w:hint="default"/>
+      </w:rPr>
+    </w:lvl>
+    <w:lvl w:ilvl="2" w:tplc="04150005" w:tentative="1">
+      <w:start w:val="1"/>
+      <w:numFmt w:val="bullet"/>
+      <w:lvlText w:val=""/>
+      <w:lvlJc w:val="left"/>
+      <w:pPr>
+        <w:ind w:left="2160" w:hanging="360"/>
+      </w:pPr>
+      <w:rPr>
+        <w:rFonts w:ascii="Wingdings" w:hAnsi="Wingdings" w:hint="default"/>
+      </w:rPr>
+    </w:lvl>
+    <w:lvl w:ilvl="3" w:tplc="04150001" w:tentative="1">
+      <w:start w:val="1"/>
+      <w:numFmt w:val="bullet"/>
+      <w:lvlText w:val=""/>
+      <w:lvlJc w:val="left"/>
+      <w:pPr>
+        <w:ind w:left="2880" w:hanging="360"/>
+      </w:pPr>
+      <w:rPr>
+        <w:rFonts w:ascii="Symbol" w:hAnsi="Symbol" w:hint="default"/>
+      </w:rPr>
+    </w:lvl>
+    <w:lvl w:ilvl="4" w:tplc="04150003" w:tentative="1">
+      <w:start w:val="1"/>
+      <w:numFmt w:val="bullet"/>
+      <w:lvlText w:val="o"/>
+      <w:lvlJc w:val="left"/>
+      <w:pPr>
+        <w:ind w:left="3600" w:hanging="360"/>
+      </w:pPr>
+      <w:rPr>
+        <w:rFonts w:ascii="Courier New" w:hAnsi="Courier New" w:cs="Courier New" w:hint="default"/>
+      </w:rPr>
+    </w:lvl>
+    <w:lvl w:ilvl="5" w:tplc="04150005" w:tentative="1">
+      <w:start w:val="1"/>
+      <w:numFmt w:val="bullet"/>
+      <w:lvlText w:val=""/>
+      <w:lvlJc w:val="left"/>
+      <w:pPr>
+        <w:ind w:left="4320" w:hanging="360"/>
+      </w:pPr>
+      <w:rPr>
+        <w:rFonts w:ascii="Wingdings" w:hAnsi="Wingdings" w:hint="default"/>
+      </w:rPr>
+    </w:lvl>
+    <w:lvl w:ilvl="6" w:tplc="04150001" w:tentative="1">
+      <w:start w:val="1"/>
+      <w:numFmt w:val="bullet"/>
+      <w:lvlText w:val=""/>
+      <w:lvlJc w:val="left"/>
+      <w:pPr>
+        <w:ind w:left="5040" w:hanging="360"/>
+      </w:pPr>
+      <w:rPr>
+        <w:rFonts w:ascii="Symbol" w:hAnsi="Symbol" w:hint="default"/>
+      </w:rPr>
+    </w:lvl>
+    <w:lvl w:ilvl="7" w:tplc="04150003" w:tentative="1">
+      <w:start w:val="1"/>
+      <w:numFmt w:val="bullet"/>
+      <w:lvlText w:val="o"/>
+      <w:lvlJc w:val="left"/>
+      <w:pPr>
+        <w:ind w:left="5760" w:hanging="360"/>
+      </w:pPr>
+      <w:rPr>
+        <w:rFonts w:ascii="Courier New" w:hAnsi="Courier New" w:cs="Courier New" w:hint="default"/>
+      </w:rPr>
+    </w:lvl>
+    <w:lvl w:ilvl="8" w:tplc="04150005" w:tentative="1">
+      <w:start w:val="1"/>
+      <w:numFmt w:val="bullet"/>
+      <w:lvlText w:val=""/>
+      <w:lvlJc w:val="left"/>
+      <w:pPr>
+        <w:ind w:left="6480" w:hanging="360"/>
+      </w:pPr>
+      <w:rPr>
+        <w:rFonts w:ascii="Wingdings" w:hAnsi="Wingdings" w:hint="default"/>
+      </w:rPr>
+    </w:lvl>
+  </w:abstractNum>
   <w:num w:numId="1" w16cid:durableId="908340920">
     <w:abstractNumId w:val="0"/>
   </w:num>
   <w:num w:numId="2" w16cid:durableId="1183936769">
     <w:abstractNumId w:val="1"/>
+  </w:num>
+  <w:num w:numId="3" w16cid:durableId="1983536023">
+    <w:abstractNumId w:val="2"/>
   </w:num>
 </w:numbering>
 </file>
@@ -2260,4 +2807,287 @@
     </a:ext>
   </a:extLst>
 </a:theme>
+</file>
+
+<file path=customXml/item1.xml><?xml version="1.0" encoding="utf-8"?>
+<ct:contentTypeSchema xmlns:ct="http://schemas.microsoft.com/office/2006/metadata/contentType" xmlns:ma="http://schemas.microsoft.com/office/2006/metadata/properties/metaAttributes" ct:_="" ma:_="" ma:contentTypeName="Document" ma:contentTypeID="0x010100E3B43AB9E0A31E49BE557F9BA35C49DE" ma:contentTypeVersion="14" ma:contentTypeDescription="Create a new document." ma:contentTypeScope="" ma:versionID="8c1de741d22a1a1deaadef11360d32a9">
+  <xsd:schema xmlns:xsd="http://www.w3.org/2001/XMLSchema" xmlns:xs="http://www.w3.org/2001/XMLSchema" xmlns:p="http://schemas.microsoft.com/office/2006/metadata/properties" xmlns:ns3="087b2d2f-c240-42a2-a784-8ee6be4a7dea" xmlns:ns4="3f1c283a-b898-4b64-94c2-c4e6c2a3512a" targetNamespace="http://schemas.microsoft.com/office/2006/metadata/properties" ma:root="true" ma:fieldsID="135138f4363cf77ee1e2fcd7e6a601f5" ns3:_="" ns4:_="">
+    <xsd:import namespace="087b2d2f-c240-42a2-a784-8ee6be4a7dea"/>
+    <xsd:import namespace="3f1c283a-b898-4b64-94c2-c4e6c2a3512a"/>
+    <xsd:element name="properties">
+      <xsd:complexType>
+        <xsd:sequence>
+          <xsd:element name="documentManagement">
+            <xsd:complexType>
+              <xsd:all>
+                <xsd:element ref="ns3:MediaServiceMetadata" minOccurs="0"/>
+                <xsd:element ref="ns3:MediaServiceFastMetadata" minOccurs="0"/>
+                <xsd:element ref="ns3:MediaServiceAutoKeyPoints" minOccurs="0"/>
+                <xsd:element ref="ns3:MediaServiceKeyPoints" minOccurs="0"/>
+                <xsd:element ref="ns4:SharedWithUsers" minOccurs="0"/>
+                <xsd:element ref="ns4:SharedWithDetails" minOccurs="0"/>
+                <xsd:element ref="ns4:SharingHintHash" minOccurs="0"/>
+                <xsd:element ref="ns3:MediaServiceAutoTags" minOccurs="0"/>
+                <xsd:element ref="ns3:MediaServiceOCR" minOccurs="0"/>
+                <xsd:element ref="ns3:MediaServiceGenerationTime" minOccurs="0"/>
+                <xsd:element ref="ns3:MediaServiceEventHashCode" minOccurs="0"/>
+                <xsd:element ref="ns3:_activity" minOccurs="0"/>
+                <xsd:element ref="ns3:MediaServiceSearchProperties" minOccurs="0"/>
+                <xsd:element ref="ns3:MediaServiceObjectDetectorVersions" minOccurs="0"/>
+              </xsd:all>
+            </xsd:complexType>
+          </xsd:element>
+        </xsd:sequence>
+      </xsd:complexType>
+    </xsd:element>
+  </xsd:schema>
+  <xsd:schema xmlns:xsd="http://www.w3.org/2001/XMLSchema" xmlns:xs="http://www.w3.org/2001/XMLSchema" xmlns:dms="http://schemas.microsoft.com/office/2006/documentManagement/types" xmlns:pc="http://schemas.microsoft.com/office/infopath/2007/PartnerControls" targetNamespace="087b2d2f-c240-42a2-a784-8ee6be4a7dea" elementFormDefault="qualified">
+    <xsd:import namespace="http://schemas.microsoft.com/office/2006/documentManagement/types"/>
+    <xsd:import namespace="http://schemas.microsoft.com/office/infopath/2007/PartnerControls"/>
+    <xsd:element name="MediaServiceMetadata" ma:index="8" nillable="true" ma:displayName="MediaServiceMetadata" ma:hidden="true" ma:internalName="MediaServiceMetadata" ma:readOnly="true">
+      <xsd:simpleType>
+        <xsd:restriction base="dms:Note"/>
+      </xsd:simpleType>
+    </xsd:element>
+    <xsd:element name="MediaServiceFastMetadata" ma:index="9" nillable="true" ma:displayName="MediaServiceFastMetadata" ma:hidden="true" ma:internalName="MediaServiceFastMetadata" ma:readOnly="true">
+      <xsd:simpleType>
+        <xsd:restriction base="dms:Note"/>
+      </xsd:simpleType>
+    </xsd:element>
+    <xsd:element name="MediaServiceAutoKeyPoints" ma:index="10" nillable="true" ma:displayName="MediaServiceAutoKeyPoints" ma:hidden="true" ma:internalName="MediaServiceAutoKeyPoints" ma:readOnly="true">
+      <xsd:simpleType>
+        <xsd:restriction base="dms:Note"/>
+      </xsd:simpleType>
+    </xsd:element>
+    <xsd:element name="MediaServiceKeyPoints" ma:index="11" nillable="true" ma:displayName="KeyPoints" ma:internalName="MediaServiceKeyPoints" ma:readOnly="true">
+      <xsd:simpleType>
+        <xsd:restriction base="dms:Note">
+          <xsd:maxLength value="255"/>
+        </xsd:restriction>
+      </xsd:simpleType>
+    </xsd:element>
+    <xsd:element name="MediaServiceAutoTags" ma:index="15" nillable="true" ma:displayName="Tags" ma:internalName="MediaServiceAutoTags" ma:readOnly="true">
+      <xsd:simpleType>
+        <xsd:restriction base="dms:Text"/>
+      </xsd:simpleType>
+    </xsd:element>
+    <xsd:element name="MediaServiceOCR" ma:index="16" nillable="true" ma:displayName="Extracted Text" ma:internalName="MediaServiceOCR" ma:readOnly="true">
+      <xsd:simpleType>
+        <xsd:restriction base="dms:Note">
+          <xsd:maxLength value="255"/>
+        </xsd:restriction>
+      </xsd:simpleType>
+    </xsd:element>
+    <xsd:element name="MediaServiceGenerationTime" ma:index="17" nillable="true" ma:displayName="MediaServiceGenerationTime" ma:hidden="true" ma:internalName="MediaServiceGenerationTime" ma:readOnly="true">
+      <xsd:simpleType>
+        <xsd:restriction base="dms:Text"/>
+      </xsd:simpleType>
+    </xsd:element>
+    <xsd:element name="MediaServiceEventHashCode" ma:index="18" nillable="true" ma:displayName="MediaServiceEventHashCode" ma:hidden="true" ma:internalName="MediaServiceEventHashCode" ma:readOnly="true">
+      <xsd:simpleType>
+        <xsd:restriction base="dms:Text"/>
+      </xsd:simpleType>
+    </xsd:element>
+    <xsd:element name="_activity" ma:index="19" nillable="true" ma:displayName="_activity" ma:hidden="true" ma:internalName="_activity">
+      <xsd:simpleType>
+        <xsd:restriction base="dms:Note"/>
+      </xsd:simpleType>
+    </xsd:element>
+    <xsd:element name="MediaServiceSearchProperties" ma:index="20" nillable="true" ma:displayName="MediaServiceSearchProperties" ma:hidden="true" ma:internalName="MediaServiceSearchProperties" ma:readOnly="true">
+      <xsd:simpleType>
+        <xsd:restriction base="dms:Note"/>
+      </xsd:simpleType>
+    </xsd:element>
+    <xsd:element name="MediaServiceObjectDetectorVersions" ma:index="21" nillable="true" ma:displayName="MediaServiceObjectDetectorVersions" ma:hidden="true" ma:indexed="true" ma:internalName="MediaServiceObjectDetectorVersions" ma:readOnly="true">
+      <xsd:simpleType>
+        <xsd:restriction base="dms:Text"/>
+      </xsd:simpleType>
+    </xsd:element>
+  </xsd:schema>
+  <xsd:schema xmlns:xsd="http://www.w3.org/2001/XMLSchema" xmlns:xs="http://www.w3.org/2001/XMLSchema" xmlns:dms="http://schemas.microsoft.com/office/2006/documentManagement/types" xmlns:pc="http://schemas.microsoft.com/office/infopath/2007/PartnerControls" targetNamespace="3f1c283a-b898-4b64-94c2-c4e6c2a3512a" elementFormDefault="qualified">
+    <xsd:import namespace="http://schemas.microsoft.com/office/2006/documentManagement/types"/>
+    <xsd:import namespace="http://schemas.microsoft.com/office/infopath/2007/PartnerControls"/>
+    <xsd:element name="SharedWithUsers" ma:index="12" nillable="true" ma:displayName="Shared With" ma:internalName="SharedWithUsers" ma:readOnly="true">
+      <xsd:complexType>
+        <xsd:complexContent>
+          <xsd:extension base="dms:UserMulti">
+            <xsd:sequence>
+              <xsd:element name="UserInfo" minOccurs="0" maxOccurs="unbounded">
+                <xsd:complexType>
+                  <xsd:sequence>
+                    <xsd:element name="DisplayName" type="xsd:string" minOccurs="0"/>
+                    <xsd:element name="AccountId" type="dms:UserId" minOccurs="0" nillable="true"/>
+                    <xsd:element name="AccountType" type="xsd:string" minOccurs="0"/>
+                  </xsd:sequence>
+                </xsd:complexType>
+              </xsd:element>
+            </xsd:sequence>
+          </xsd:extension>
+        </xsd:complexContent>
+      </xsd:complexType>
+    </xsd:element>
+    <xsd:element name="SharedWithDetails" ma:index="13" nillable="true" ma:displayName="Shared With Details" ma:internalName="SharedWithDetails" ma:readOnly="true">
+      <xsd:simpleType>
+        <xsd:restriction base="dms:Note">
+          <xsd:maxLength value="255"/>
+        </xsd:restriction>
+      </xsd:simpleType>
+    </xsd:element>
+    <xsd:element name="SharingHintHash" ma:index="14" nillable="true" ma:displayName="Sharing Hint Hash" ma:hidden="true" ma:internalName="SharingHintHash" ma:readOnly="true">
+      <xsd:simpleType>
+        <xsd:restriction base="dms:Text"/>
+      </xsd:simpleType>
+    </xsd:element>
+  </xsd:schema>
+  <xsd:schema xmlns="http://schemas.openxmlformats.org/package/2006/metadata/core-properties" xmlns:xsd="http://www.w3.org/2001/XMLSchema" xmlns:xsi="http://www.w3.org/2001/XMLSchema-instance" xmlns:dc="http://purl.org/dc/elements/1.1/" xmlns:dcterms="http://purl.org/dc/terms/" xmlns:odoc="http://schemas.microsoft.com/internal/obd" targetNamespace="http://schemas.openxmlformats.org/package/2006/metadata/core-properties" elementFormDefault="qualified" attributeFormDefault="unqualified" blockDefault="#all">
+    <xsd:import namespace="http://purl.org/dc/elements/1.1/" schemaLocation="http://dublincore.org/schemas/xmls/qdc/2003/04/02/dc.xsd"/>
+    <xsd:import namespace="http://purl.org/dc/terms/" schemaLocation="http://dublincore.org/schemas/xmls/qdc/2003/04/02/dcterms.xsd"/>
+    <xsd:element name="coreProperties" type="CT_coreProperties"/>
+    <xsd:complexType name="CT_coreProperties">
+      <xsd:all>
+        <xsd:element ref="dc:creator" minOccurs="0" maxOccurs="1"/>
+        <xsd:element ref="dcterms:created" minOccurs="0" maxOccurs="1"/>
+        <xsd:element ref="dc:identifier" minOccurs="0" maxOccurs="1"/>
+        <xsd:element name="contentType" minOccurs="0" maxOccurs="1" type="xsd:string" ma:index="0" ma:displayName="Content Type"/>
+        <xsd:element ref="dc:title" minOccurs="0" maxOccurs="1" ma:index="4" ma:displayName="Title"/>
+        <xsd:element ref="dc:subject" minOccurs="0" maxOccurs="1"/>
+        <xsd:element ref="dc:description" minOccurs="0" maxOccurs="1"/>
+        <xsd:element name="keywords" minOccurs="0" maxOccurs="1" type="xsd:string"/>
+        <xsd:element ref="dc:language" minOccurs="0" maxOccurs="1"/>
+        <xsd:element name="category" minOccurs="0" maxOccurs="1" type="xsd:string"/>
+        <xsd:element name="version" minOccurs="0" maxOccurs="1" type="xsd:string"/>
+        <xsd:element name="revision" minOccurs="0" maxOccurs="1" type="xsd:string">
+          <xsd:annotation>
+            <xsd:documentation>
+                        This value indicates the number of saves or revisions. The application is responsible for updating this value after each revision.
+                    </xsd:documentation>
+          </xsd:annotation>
+        </xsd:element>
+        <xsd:element name="lastModifiedBy" minOccurs="0" maxOccurs="1" type="xsd:string"/>
+        <xsd:element ref="dcterms:modified" minOccurs="0" maxOccurs="1"/>
+        <xsd:element name="contentStatus" minOccurs="0" maxOccurs="1" type="xsd:string"/>
+      </xsd:all>
+    </xsd:complexType>
+  </xsd:schema>
+  <xs:schema xmlns:pc="http://schemas.microsoft.com/office/infopath/2007/PartnerControls" xmlns:xs="http://www.w3.org/2001/XMLSchema" targetNamespace="http://schemas.microsoft.com/office/infopath/2007/PartnerControls" elementFormDefault="qualified" attributeFormDefault="unqualified">
+    <xs:element name="Person">
+      <xs:complexType>
+        <xs:sequence>
+          <xs:element ref="pc:DisplayName" minOccurs="0"/>
+          <xs:element ref="pc:AccountId" minOccurs="0"/>
+          <xs:element ref="pc:AccountType" minOccurs="0"/>
+        </xs:sequence>
+      </xs:complexType>
+    </xs:element>
+    <xs:element name="DisplayName" type="xs:string"/>
+    <xs:element name="AccountId" type="xs:string"/>
+    <xs:element name="AccountType" type="xs:string"/>
+    <xs:element name="BDCAssociatedEntity">
+      <xs:complexType>
+        <xs:sequence>
+          <xs:element ref="pc:BDCEntity" minOccurs="0" maxOccurs="unbounded"/>
+        </xs:sequence>
+        <xs:attribute ref="pc:EntityNamespace"/>
+        <xs:attribute ref="pc:EntityName"/>
+        <xs:attribute ref="pc:SystemInstanceName"/>
+        <xs:attribute ref="pc:AssociationName"/>
+      </xs:complexType>
+    </xs:element>
+    <xs:attribute name="EntityNamespace" type="xs:string"/>
+    <xs:attribute name="EntityName" type="xs:string"/>
+    <xs:attribute name="SystemInstanceName" type="xs:string"/>
+    <xs:attribute name="AssociationName" type="xs:string"/>
+    <xs:element name="BDCEntity">
+      <xs:complexType>
+        <xs:sequence>
+          <xs:element ref="pc:EntityDisplayName" minOccurs="0"/>
+          <xs:element ref="pc:EntityInstanceReference" minOccurs="0"/>
+          <xs:element ref="pc:EntityId1" minOccurs="0"/>
+          <xs:element ref="pc:EntityId2" minOccurs="0"/>
+          <xs:element ref="pc:EntityId3" minOccurs="0"/>
+          <xs:element ref="pc:EntityId4" minOccurs="0"/>
+          <xs:element ref="pc:EntityId5" minOccurs="0"/>
+        </xs:sequence>
+      </xs:complexType>
+    </xs:element>
+    <xs:element name="EntityDisplayName" type="xs:string"/>
+    <xs:element name="EntityInstanceReference" type="xs:string"/>
+    <xs:element name="EntityId1" type="xs:string"/>
+    <xs:element name="EntityId2" type="xs:string"/>
+    <xs:element name="EntityId3" type="xs:string"/>
+    <xs:element name="EntityId4" type="xs:string"/>
+    <xs:element name="EntityId5" type="xs:string"/>
+    <xs:element name="Terms">
+      <xs:complexType>
+        <xs:sequence>
+          <xs:element ref="pc:TermInfo" minOccurs="0" maxOccurs="unbounded"/>
+        </xs:sequence>
+      </xs:complexType>
+    </xs:element>
+    <xs:element name="TermInfo">
+      <xs:complexType>
+        <xs:sequence>
+          <xs:element ref="pc:TermName" minOccurs="0"/>
+          <xs:element ref="pc:TermId" minOccurs="0"/>
+        </xs:sequence>
+      </xs:complexType>
+    </xs:element>
+    <xs:element name="TermName" type="xs:string"/>
+    <xs:element name="TermId" type="xs:string"/>
+  </xs:schema>
+</ct:contentTypeSchema>
+</file>
+
+<file path=customXml/item2.xml><?xml version="1.0" encoding="utf-8"?>
+<?mso-contentType ?>
+<FormTemplates xmlns="http://schemas.microsoft.com/sharepoint/v3/contenttype/forms">
+  <Display>DocumentLibraryForm</Display>
+  <Edit>DocumentLibraryForm</Edit>
+  <New>DocumentLibraryForm</New>
+</FormTemplates>
+</file>
+
+<file path=customXml/item3.xml><?xml version="1.0" encoding="utf-8"?>
+<p:properties xmlns:p="http://schemas.microsoft.com/office/2006/metadata/properties" xmlns:xsi="http://www.w3.org/2001/XMLSchema-instance" xmlns:pc="http://schemas.microsoft.com/office/infopath/2007/PartnerControls">
+  <documentManagement>
+    <_activity xmlns="087b2d2f-c240-42a2-a784-8ee6be4a7dea" xsi:nil="true"/>
+  </documentManagement>
+</p:properties>
+</file>
+
+<file path=customXml/itemProps1.xml><?xml version="1.0" encoding="utf-8"?>
+<ds:datastoreItem xmlns:ds="http://schemas.openxmlformats.org/officeDocument/2006/customXml" ds:itemID="{7198FAFE-E9A2-4DB0-B938-17D8EC47C5CA}">
+  <ds:schemaRefs>
+    <ds:schemaRef ds:uri="http://schemas.microsoft.com/office/2006/metadata/contentType"/>
+    <ds:schemaRef ds:uri="http://schemas.microsoft.com/office/2006/metadata/properties/metaAttributes"/>
+    <ds:schemaRef ds:uri="http://www.w3.org/2001/XMLSchema"/>
+    <ds:schemaRef ds:uri="http://schemas.microsoft.com/office/2006/metadata/properties"/>
+    <ds:schemaRef ds:uri="087b2d2f-c240-42a2-a784-8ee6be4a7dea"/>
+    <ds:schemaRef ds:uri="3f1c283a-b898-4b64-94c2-c4e6c2a3512a"/>
+    <ds:schemaRef ds:uri="http://schemas.microsoft.com/office/2006/documentManagement/types"/>
+    <ds:schemaRef ds:uri="http://schemas.microsoft.com/office/infopath/2007/PartnerControls"/>
+    <ds:schemaRef ds:uri="http://schemas.openxmlformats.org/package/2006/metadata/core-properties"/>
+    <ds:schemaRef ds:uri="http://purl.org/dc/elements/1.1/"/>
+    <ds:schemaRef ds:uri="http://purl.org/dc/terms/"/>
+    <ds:schemaRef ds:uri="http://schemas.microsoft.com/internal/obd"/>
+  </ds:schemaRefs>
+</ds:datastoreItem>
+</file>
+
+<file path=customXml/itemProps2.xml><?xml version="1.0" encoding="utf-8"?>
+<ds:datastoreItem xmlns:ds="http://schemas.openxmlformats.org/officeDocument/2006/customXml" ds:itemID="{ED84F899-01E8-466F-8701-4AC42EBEE7DA}">
+  <ds:schemaRefs>
+    <ds:schemaRef ds:uri="http://schemas.microsoft.com/sharepoint/v3/contenttype/forms"/>
+  </ds:schemaRefs>
+</ds:datastoreItem>
+</file>
+
+<file path=customXml/itemProps3.xml><?xml version="1.0" encoding="utf-8"?>
+<ds:datastoreItem xmlns:ds="http://schemas.openxmlformats.org/officeDocument/2006/customXml" ds:itemID="{A20903FF-E027-4F78-9EB6-7BA5BD39FF88}">
+  <ds:schemaRefs>
+    <ds:schemaRef ds:uri="http://schemas.microsoft.com/office/2006/metadata/properties"/>
+    <ds:schemaRef ds:uri="http://schemas.microsoft.com/office/infopath/2007/PartnerControls"/>
+    <ds:schemaRef ds:uri="087b2d2f-c240-42a2-a784-8ee6be4a7dea"/>
+  </ds:schemaRefs>
+</ds:datastoreItem>
 </file>
</xml_diff>

<commit_message>
D: Added password for odcx file
</commit_message>
<xml_diff>
--- a/docs/praca_inz.docx
+++ b/docs/praca_inz.docx
@@ -59,6 +59,19 @@
       </w:pPr>
       <w:r>
         <w:t>Koncepcja systemu XYZ</w:t>
+      </w:r>
+    </w:p>
+    <w:p>
+      <w:pPr>
+        <w:pStyle w:val="Heading2"/>
+      </w:pPr>
+      <w:r>
+        <w:t>Założenia</w:t>
+      </w:r>
+    </w:p>
+    <w:p>
+      <w:r>
+        <w:t>System Lyix w swoim założeniu ma być kompleksowym systemem do śledzenia i weryfikowania działań osób publicznych. Rejestruje dane osób publicznych</w:t>
       </w:r>
     </w:p>
     <w:p>
@@ -186,128 +199,138 @@
         <w:pStyle w:val="Heading2"/>
       </w:pPr>
       <w:r>
+        <w:t>Procesy biznesowe</w:t>
+      </w:r>
+    </w:p>
+    <w:p>
+      <w:pPr>
+        <w:pStyle w:val="Heading3"/>
+      </w:pPr>
+      <w:r>
+        <w:t>Proces zakładania konta dla zwykłego użytkownika</w:t>
+      </w:r>
+    </w:p>
+    <w:p>
+      <w:r>
+        <w:t>Proces zakładania konta użytkownika rozpoczyna się od wejścia na stronę systemu lub pobrania aplikacji. Nastęnie użytkownik klika przycisk „dołącz”. Są dwa typy użytkowników: „Użytkownik zwykły” i „Użytkownik osoba publiczna”. Użytkownik wybiera typ użytkownika.</w:t>
+      </w:r>
+    </w:p>
+    <w:p>
+      <w:r>
+        <w:t>Użytkownik zwykły: Wpisuje dane wymagane do utworzenia konta (email, hasło, nick) moze uzupełłnić informacje dodatkowe (telefon, zdjęcie profilowe), lub przejść dalej.</w:t>
+      </w:r>
+    </w:p>
+    <w:p>
+      <w:pPr>
+        <w:pStyle w:val="Heading3"/>
+      </w:pPr>
+      <w:r>
+        <w:t>Proces zakładania konta dla osoby publicznej</w:t>
+      </w:r>
+    </w:p>
+    <w:p>
+      <w:pPr>
+        <w:pStyle w:val="Heading2"/>
+      </w:pPr>
+      <w:r>
+        <w:t>Logiczny model danych</w:t>
+      </w:r>
+    </w:p>
+    <w:p>
+      <w:pPr>
+        <w:pStyle w:val="Heading2"/>
+      </w:pPr>
+      <w:r>
+        <w:t>Diagram kontekstowy</w:t>
+      </w:r>
+    </w:p>
+    <w:p>
+      <w:pPr>
+        <w:pStyle w:val="Heading2"/>
+      </w:pPr>
+      <w:r>
+        <w:t>Komponenty</w:t>
+      </w:r>
+    </w:p>
+    <w:p>
+      <w:pPr>
+        <w:ind w:firstLine="576"/>
+      </w:pPr>
+      <w:r>
+        <w:t>W ramach podrozdziału opisałam poszczególne komponenty składajjące się na system Lyix</w:t>
+      </w:r>
+    </w:p>
+    <w:p>
+      <w:pPr>
+        <w:pStyle w:val="Heading3"/>
+      </w:pPr>
+      <w:r>
+        <w:t>Nazwa komponentu &lt;sklep online&gt;</w:t>
+      </w:r>
+    </w:p>
+    <w:p>
+      <w:pPr>
+        <w:pStyle w:val="Heading4"/>
+      </w:pPr>
+      <w:r>
+        <w:t>Opis komponentu</w:t>
+      </w:r>
+    </w:p>
+    <w:p>
+      <w:pPr>
+        <w:pStyle w:val="Heading4"/>
+      </w:pPr>
+      <w:r>
+        <w:t>Wymagania funkcjonalne</w:t>
+      </w:r>
+    </w:p>
+    <w:p>
+      <w:pPr>
+        <w:pStyle w:val="Heading4"/>
+      </w:pPr>
+      <w:r>
+        <w:t>Wymagania niefunklcjonalne</w:t>
+      </w:r>
+    </w:p>
+    <w:p>
+      <w:pPr>
+        <w:pStyle w:val="Heading4"/>
+      </w:pPr>
+      <w:r>
+        <w:t>Charakterystyka użytkowników</w:t>
+      </w:r>
+    </w:p>
+    <w:p>
+      <w:pPr>
+        <w:pStyle w:val="Heading4"/>
+      </w:pPr>
+      <w:r>
+        <w:t>Przypadki użycia</w:t>
+      </w:r>
+    </w:p>
+    <w:p>
+      <w:pPr>
+        <w:pStyle w:val="Heading4"/>
+      </w:pPr>
+      <w:r>
+        <w:t>Diagramy aktywności</w:t>
+      </w:r>
+    </w:p>
+    <w:p>
+      <w:pPr>
+        <w:pStyle w:val="Heading4"/>
+      </w:pPr>
+      <w:r>
+        <w:t>Macierz uprawnień</w:t>
+      </w:r>
+    </w:p>
+    <w:p/>
+    <w:p>
+      <w:pPr>
+        <w:pStyle w:val="Heading2"/>
+      </w:pPr>
+      <w:r>
         <w:lastRenderedPageBreak/>
-        <w:t>Procesy biznesowe</w:t>
-      </w:r>
-    </w:p>
-    <w:p>
-      <w:pPr>
-        <w:pStyle w:val="Heading3"/>
-      </w:pPr>
-      <w:r>
-        <w:t>Proces zakładania konta dla zwykłego użytkownika</w:t>
-      </w:r>
-    </w:p>
-    <w:p>
-      <w:pPr>
-        <w:pStyle w:val="Heading3"/>
-      </w:pPr>
-      <w:r>
-        <w:t>Proces zakładania konta dla osoby publicznej</w:t>
-      </w:r>
-    </w:p>
-    <w:p>
-      <w:pPr>
-        <w:pStyle w:val="Heading2"/>
-      </w:pPr>
-      <w:r>
-        <w:t>Logiczny model danych</w:t>
-      </w:r>
-    </w:p>
-    <w:p>
-      <w:pPr>
-        <w:pStyle w:val="Heading2"/>
-      </w:pPr>
-      <w:r>
-        <w:t>Diagram kontekstowy</w:t>
-      </w:r>
-    </w:p>
-    <w:p>
-      <w:pPr>
-        <w:pStyle w:val="Heading2"/>
-      </w:pPr>
-      <w:r>
-        <w:t>Komponenty</w:t>
-      </w:r>
-    </w:p>
-    <w:p>
-      <w:pPr>
-        <w:ind w:firstLine="576"/>
-      </w:pPr>
-      <w:r>
-        <w:t>W ramach podrozdziału opisałam poszczególne komponenty składajjące się na system Lyix</w:t>
-      </w:r>
-    </w:p>
-    <w:p>
-      <w:pPr>
-        <w:pStyle w:val="Heading3"/>
-      </w:pPr>
-      <w:r>
-        <w:t>Nazwa komponentu &lt;sklep online&gt;</w:t>
-      </w:r>
-    </w:p>
-    <w:p>
-      <w:pPr>
-        <w:pStyle w:val="Heading4"/>
-      </w:pPr>
-      <w:r>
-        <w:t>Opis komponentu</w:t>
-      </w:r>
-    </w:p>
-    <w:p>
-      <w:pPr>
-        <w:pStyle w:val="Heading4"/>
-      </w:pPr>
-      <w:r>
-        <w:t>Wymagania funkcjonalne</w:t>
-      </w:r>
-    </w:p>
-    <w:p>
-      <w:pPr>
-        <w:pStyle w:val="Heading4"/>
-      </w:pPr>
-      <w:r>
-        <w:t>Wymagania niefunklcjonalne</w:t>
-      </w:r>
-    </w:p>
-    <w:p>
-      <w:pPr>
-        <w:pStyle w:val="Heading4"/>
-      </w:pPr>
-      <w:r>
-        <w:t>Charakterystyka użytkowników</w:t>
-      </w:r>
-    </w:p>
-    <w:p>
-      <w:pPr>
-        <w:pStyle w:val="Heading4"/>
-      </w:pPr>
-      <w:r>
-        <w:t>Przypadki użycia</w:t>
-      </w:r>
-    </w:p>
-    <w:p>
-      <w:pPr>
-        <w:pStyle w:val="Heading4"/>
-      </w:pPr>
-      <w:r>
-        <w:t>Diagramy aktywności</w:t>
-      </w:r>
-    </w:p>
-    <w:p>
-      <w:pPr>
-        <w:pStyle w:val="Heading4"/>
-      </w:pPr>
-      <w:r>
-        <w:t>Macierz uprawnień</w:t>
-      </w:r>
-    </w:p>
-    <w:p/>
-    <w:p>
-      <w:pPr>
-        <w:pStyle w:val="Heading2"/>
-      </w:pPr>
-      <w:r>
         <w:t>Fizyczny model danych</w:t>
       </w:r>
     </w:p>
@@ -2254,23 +2277,6 @@
 </file>
 
 <file path=customXml/item1.xml><?xml version="1.0" encoding="utf-8"?>
-<p:properties xmlns:p="http://schemas.microsoft.com/office/2006/metadata/properties" xmlns:xsi="http://www.w3.org/2001/XMLSchema-instance" xmlns:pc="http://schemas.microsoft.com/office/infopath/2007/PartnerControls">
-  <documentManagement>
-    <_activity xmlns="087b2d2f-c240-42a2-a784-8ee6be4a7dea" xsi:nil="true"/>
-  </documentManagement>
-</p:properties>
-</file>
-
-<file path=customXml/item2.xml><?xml version="1.0" encoding="utf-8"?>
-<?mso-contentType ?>
-<FormTemplates xmlns="http://schemas.microsoft.com/sharepoint/v3/contenttype/forms">
-  <Display>DocumentLibraryForm</Display>
-  <Edit>DocumentLibraryForm</Edit>
-  <New>DocumentLibraryForm</New>
-</FormTemplates>
-</file>
-
-<file path=customXml/item3.xml><?xml version="1.0" encoding="utf-8"?>
 <ct:contentTypeSchema xmlns:ct="http://schemas.microsoft.com/office/2006/metadata/contentType" xmlns:ma="http://schemas.microsoft.com/office/2006/metadata/properties/metaAttributes" ct:_="" ma:_="" ma:contentTypeName="Document" ma:contentTypeID="0x010100E3B43AB9E0A31E49BE557F9BA35C49DE" ma:contentTypeVersion="14" ma:contentTypeDescription="Create a new document." ma:contentTypeScope="" ma:versionID="8c1de741d22a1a1deaadef11360d32a9">
   <xsd:schema xmlns:xsd="http://www.w3.org/2001/XMLSchema" xmlns:xs="http://www.w3.org/2001/XMLSchema" xmlns:p="http://schemas.microsoft.com/office/2006/metadata/properties" xmlns:ns3="087b2d2f-c240-42a2-a784-8ee6be4a7dea" xmlns:ns4="3f1c283a-b898-4b64-94c2-c4e6c2a3512a" targetNamespace="http://schemas.microsoft.com/office/2006/metadata/properties" ma:root="true" ma:fieldsID="135138f4363cf77ee1e2fcd7e6a601f5" ns3:_="" ns4:_="">
     <xsd:import namespace="087b2d2f-c240-42a2-a784-8ee6be4a7dea"/>
@@ -2499,32 +2505,24 @@
 </ct:contentTypeSchema>
 </file>
 
-<file path=customXml/itemProps1.xml><?xml version="1.0" encoding="utf-8"?>
-<ds:datastoreItem xmlns:ds="http://schemas.openxmlformats.org/officeDocument/2006/customXml" ds:itemID="{A20903FF-E027-4F78-9EB6-7BA5BD39FF88}">
-  <ds:schemaRefs>
-    <ds:schemaRef ds:uri="http://schemas.microsoft.com/office/2006/metadata/properties"/>
-    <ds:schemaRef ds:uri="087b2d2f-c240-42a2-a784-8ee6be4a7dea"/>
-    <ds:schemaRef ds:uri="http://purl.org/dc/elements/1.1/"/>
-    <ds:schemaRef ds:uri="http://schemas.microsoft.com/office/2006/documentManagement/types"/>
-    <ds:schemaRef ds:uri="http://www.w3.org/XML/1998/namespace"/>
-    <ds:schemaRef ds:uri="http://schemas.microsoft.com/office/infopath/2007/PartnerControls"/>
-    <ds:schemaRef ds:uri="http://purl.org/dc/terms/"/>
-    <ds:schemaRef ds:uri="http://schemas.openxmlformats.org/package/2006/metadata/core-properties"/>
-    <ds:schemaRef ds:uri="3f1c283a-b898-4b64-94c2-c4e6c2a3512a"/>
-    <ds:schemaRef ds:uri="http://purl.org/dc/dcmitype/"/>
-  </ds:schemaRefs>
-</ds:datastoreItem>
+<file path=customXml/item2.xml><?xml version="1.0" encoding="utf-8"?>
+<?mso-contentType ?>
+<FormTemplates xmlns="http://schemas.microsoft.com/sharepoint/v3/contenttype/forms">
+  <Display>DocumentLibraryForm</Display>
+  <Edit>DocumentLibraryForm</Edit>
+  <New>DocumentLibraryForm</New>
+</FormTemplates>
 </file>
 
-<file path=customXml/itemProps2.xml><?xml version="1.0" encoding="utf-8"?>
-<ds:datastoreItem xmlns:ds="http://schemas.openxmlformats.org/officeDocument/2006/customXml" ds:itemID="{ED84F899-01E8-466F-8701-4AC42EBEE7DA}">
-  <ds:schemaRefs>
-    <ds:schemaRef ds:uri="http://schemas.microsoft.com/sharepoint/v3/contenttype/forms"/>
-  </ds:schemaRefs>
-</ds:datastoreItem>
+<file path=customXml/item3.xml><?xml version="1.0" encoding="utf-8"?>
+<p:properties xmlns:p="http://schemas.microsoft.com/office/2006/metadata/properties" xmlns:xsi="http://www.w3.org/2001/XMLSchema-instance" xmlns:pc="http://schemas.microsoft.com/office/infopath/2007/PartnerControls">
+  <documentManagement>
+    <_activity xmlns="087b2d2f-c240-42a2-a784-8ee6be4a7dea" xsi:nil="true"/>
+  </documentManagement>
+</p:properties>
 </file>
 
-<file path=customXml/itemProps3.xml><?xml version="1.0" encoding="utf-8"?>
+<file path=customXml/itemProps1.xml><?xml version="1.0" encoding="utf-8"?>
 <ds:datastoreItem xmlns:ds="http://schemas.openxmlformats.org/officeDocument/2006/customXml" ds:itemID="{7198FAFE-E9A2-4DB0-B938-17D8EC47C5CA}">
   <ds:schemaRefs>
     <ds:schemaRef ds:uri="http://schemas.microsoft.com/office/2006/metadata/contentType"/>
@@ -2541,4 +2539,22 @@
     <ds:schemaRef ds:uri="http://schemas.microsoft.com/internal/obd"/>
   </ds:schemaRefs>
 </ds:datastoreItem>
+</file>
+
+<file path=customXml/itemProps2.xml><?xml version="1.0" encoding="utf-8"?>
+<ds:datastoreItem xmlns:ds="http://schemas.openxmlformats.org/officeDocument/2006/customXml" ds:itemID="{ED84F899-01E8-466F-8701-4AC42EBEE7DA}">
+  <ds:schemaRefs>
+    <ds:schemaRef ds:uri="http://schemas.microsoft.com/sharepoint/v3/contenttype/forms"/>
+  </ds:schemaRefs>
+</ds:datastoreItem>
+</file>
+
+<file path=customXml/itemProps3.xml><?xml version="1.0" encoding="utf-8"?>
+<ds:datastoreItem xmlns:ds="http://schemas.openxmlformats.org/officeDocument/2006/customXml" ds:itemID="{A20903FF-E027-4F78-9EB6-7BA5BD39FF88}">
+  <ds:schemaRefs>
+    <ds:schemaRef ds:uri="http://schemas.microsoft.com/office/2006/metadata/properties"/>
+    <ds:schemaRef ds:uri="http://schemas.microsoft.com/office/infopath/2007/PartnerControls"/>
+    <ds:schemaRef ds:uri="087b2d2f-c240-42a2-a784-8ee6be4a7dea"/>
+  </ds:schemaRefs>
+</ds:datastoreItem>
 </file>
</xml_diff>